<commit_message>
up lại trả lời câu hỏi và có cả video lab4
</commit_message>
<xml_diff>
--- a/LAB4/11_DHCNPM2-LAB4_1150080136-LeQuocHung tra loi cau hoi.docx
+++ b/LAB4/11_DHCNPM2-LAB4_1150080136-LeQuocHung tra loi cau hoi.docx
@@ -267,12 +267,12 @@
           <wp:inline distB="19050" distT="19050" distL="19050" distR="19050">
             <wp:extent cx="5668645" cy="2898013"/>
             <wp:effectExtent b="0" l="0" r="0" t="0"/>
-            <wp:docPr id="28" name="image12.png"/>
+            <wp:docPr id="12" name="image8.png"/>
             <a:graphic>
               <a:graphicData uri="http://schemas.openxmlformats.org/drawingml/2006/picture">
                 <pic:pic>
                   <pic:nvPicPr>
-                    <pic:cNvPr id="0" name="image12.png"/>
+                    <pic:cNvPr id="0" name="image8.png"/>
                     <pic:cNvPicPr preferRelativeResize="0"/>
                   </pic:nvPicPr>
                   <pic:blipFill>
@@ -2931,12 +2931,12 @@
           <wp:inline distB="114300" distT="114300" distL="114300" distR="114300">
             <wp:extent cx="6261555" cy="3276600"/>
             <wp:effectExtent b="0" l="0" r="0" t="0"/>
-            <wp:docPr id="3" name="image18.png"/>
+            <wp:docPr id="2" name="image9.png"/>
             <a:graphic>
               <a:graphicData uri="http://schemas.openxmlformats.org/drawingml/2006/picture">
                 <pic:pic>
                   <pic:nvPicPr>
-                    <pic:cNvPr id="0" name="image18.png"/>
+                    <pic:cNvPr id="0" name="image9.png"/>
                     <pic:cNvPicPr preferRelativeResize="0"/>
                   </pic:nvPicPr>
                   <pic:blipFill>
@@ -3187,12 +3187,12 @@
           <wp:inline distB="114300" distT="114300" distL="114300" distR="114300">
             <wp:extent cx="6261555" cy="3378200"/>
             <wp:effectExtent b="0" l="0" r="0" t="0"/>
-            <wp:docPr id="37" name="image33.png"/>
+            <wp:docPr id="49" name="image29.png"/>
             <a:graphic>
               <a:graphicData uri="http://schemas.openxmlformats.org/drawingml/2006/picture">
                 <pic:pic>
                   <pic:nvPicPr>
-                    <pic:cNvPr id="0" name="image33.png"/>
+                    <pic:cNvPr id="0" name="image29.png"/>
                     <pic:cNvPicPr preferRelativeResize="0"/>
                   </pic:nvPicPr>
                   <pic:blipFill>
@@ -3376,12 +3376,12 @@
           <wp:inline distB="114300" distT="114300" distL="114300" distR="114300">
             <wp:extent cx="6261555" cy="3441700"/>
             <wp:effectExtent b="0" l="0" r="0" t="0"/>
-            <wp:docPr id="26" name="image26.png"/>
+            <wp:docPr id="41" name="image10.png"/>
             <a:graphic>
               <a:graphicData uri="http://schemas.openxmlformats.org/drawingml/2006/picture">
                 <pic:pic>
                   <pic:nvPicPr>
-                    <pic:cNvPr id="0" name="image26.png"/>
+                    <pic:cNvPr id="0" name="image10.png"/>
                     <pic:cNvPicPr preferRelativeResize="0"/>
                   </pic:nvPicPr>
                   <pic:blipFill>
@@ -3613,12 +3613,12 @@
           <wp:inline distB="114300" distT="114300" distL="114300" distR="114300">
             <wp:extent cx="6261555" cy="3492500"/>
             <wp:effectExtent b="0" l="0" r="0" t="0"/>
-            <wp:docPr id="2" name="image29.png"/>
+            <wp:docPr id="21" name="image27.png"/>
             <a:graphic>
               <a:graphicData uri="http://schemas.openxmlformats.org/drawingml/2006/picture">
                 <pic:pic>
                   <pic:nvPicPr>
-                    <pic:cNvPr id="0" name="image29.png"/>
+                    <pic:cNvPr id="0" name="image27.png"/>
                     <pic:cNvPicPr preferRelativeResize="0"/>
                   </pic:nvPicPr>
                   <pic:blipFill>
@@ -3956,12 +3956,12 @@
           <wp:inline distB="114300" distT="114300" distL="114300" distR="114300">
             <wp:extent cx="6261555" cy="3340100"/>
             <wp:effectExtent b="0" l="0" r="0" t="0"/>
-            <wp:docPr id="35" name="image35.png"/>
+            <wp:docPr id="47" name="image30.png"/>
             <a:graphic>
               <a:graphicData uri="http://schemas.openxmlformats.org/drawingml/2006/picture">
                 <pic:pic>
                   <pic:nvPicPr>
-                    <pic:cNvPr id="0" name="image35.png"/>
+                    <pic:cNvPr id="0" name="image30.png"/>
                     <pic:cNvPicPr preferRelativeResize="0"/>
                   </pic:nvPicPr>
                   <pic:blipFill>
@@ -4052,12 +4052,12 @@
           <wp:inline distB="114300" distT="114300" distL="114300" distR="114300">
             <wp:extent cx="6261555" cy="3517900"/>
             <wp:effectExtent b="0" l="0" r="0" t="0"/>
-            <wp:docPr id="10" name="image13.png"/>
+            <wp:docPr id="26" name="image35.png"/>
             <a:graphic>
               <a:graphicData uri="http://schemas.openxmlformats.org/drawingml/2006/picture">
                 <pic:pic>
                   <pic:nvPicPr>
-                    <pic:cNvPr id="0" name="image13.png"/>
+                    <pic:cNvPr id="0" name="image35.png"/>
                     <pic:cNvPicPr preferRelativeResize="0"/>
                   </pic:nvPicPr>
                   <pic:blipFill>
@@ -4148,12 +4148,12 @@
           <wp:inline distB="114300" distT="114300" distL="114300" distR="114300">
             <wp:extent cx="6261555" cy="2997200"/>
             <wp:effectExtent b="0" l="0" r="0" t="0"/>
-            <wp:docPr id="27" name="image32.png"/>
+            <wp:docPr id="11" name="image12.png"/>
             <a:graphic>
               <a:graphicData uri="http://schemas.openxmlformats.org/drawingml/2006/picture">
                 <pic:pic>
                   <pic:nvPicPr>
-                    <pic:cNvPr id="0" name="image32.png"/>
+                    <pic:cNvPr id="0" name="image12.png"/>
                     <pic:cNvPicPr preferRelativeResize="0"/>
                   </pic:nvPicPr>
                   <pic:blipFill>
@@ -4346,12 +4346,12 @@
           <wp:inline distB="114300" distT="114300" distL="114300" distR="114300">
             <wp:extent cx="6261555" cy="3378200"/>
             <wp:effectExtent b="0" l="0" r="0" t="0"/>
-            <wp:docPr id="33" name="image39.png"/>
+            <wp:docPr id="16" name="image38.png"/>
             <a:graphic>
               <a:graphicData uri="http://schemas.openxmlformats.org/drawingml/2006/picture">
                 <pic:pic>
                   <pic:nvPicPr>
-                    <pic:cNvPr id="0" name="image39.png"/>
+                    <pic:cNvPr id="0" name="image38.png"/>
                     <pic:cNvPicPr preferRelativeResize="0"/>
                   </pic:nvPicPr>
                   <pic:blipFill>
@@ -4467,12 +4467,12 @@
           <wp:inline distB="19050" distT="19050" distL="19050" distR="19050">
             <wp:extent cx="141605" cy="141605"/>
             <wp:effectExtent b="0" l="0" r="0" t="0"/>
-            <wp:docPr id="14" name="image4.png"/>
+            <wp:docPr id="7" name="image11.png"/>
             <a:graphic>
               <a:graphicData uri="http://schemas.openxmlformats.org/drawingml/2006/picture">
                 <pic:pic>
                   <pic:nvPicPr>
-                    <pic:cNvPr id="0" name="image4.png"/>
+                    <pic:cNvPr id="0" name="image11.png"/>
                     <pic:cNvPicPr preferRelativeResize="0"/>
                   </pic:nvPicPr>
                   <pic:blipFill>
@@ -4680,12 +4680,12 @@
           <wp:inline distB="19050" distT="19050" distL="19050" distR="19050">
             <wp:extent cx="5668645" cy="2898013"/>
             <wp:effectExtent b="0" l="0" r="0" t="0"/>
-            <wp:docPr id="9" name="image6.png"/>
+            <wp:docPr id="25" name="image16.png"/>
             <a:graphic>
               <a:graphicData uri="http://schemas.openxmlformats.org/drawingml/2006/picture">
                 <pic:pic>
                   <pic:nvPicPr>
-                    <pic:cNvPr id="0" name="image6.png"/>
+                    <pic:cNvPr id="0" name="image16.png"/>
                     <pic:cNvPicPr preferRelativeResize="0"/>
                   </pic:nvPicPr>
                   <pic:blipFill>
@@ -5084,12 +5084,12 @@
           <wp:inline distB="114300" distT="114300" distL="114300" distR="114300">
             <wp:extent cx="5962650" cy="5334000"/>
             <wp:effectExtent b="0" l="0" r="0" t="0"/>
-            <wp:docPr id="8" name="image25.png"/>
+            <wp:docPr id="24" name="image18.png"/>
             <a:graphic>
               <a:graphicData uri="http://schemas.openxmlformats.org/drawingml/2006/picture">
                 <pic:pic>
                   <pic:nvPicPr>
-                    <pic:cNvPr id="0" name="image25.png"/>
+                    <pic:cNvPr id="0" name="image18.png"/>
                     <pic:cNvPicPr preferRelativeResize="0"/>
                   </pic:nvPicPr>
                   <pic:blipFill>
@@ -5205,12 +5205,12 @@
           <wp:inline distB="114300" distT="114300" distL="114300" distR="114300">
             <wp:extent cx="6261555" cy="3860800"/>
             <wp:effectExtent b="0" l="0" r="0" t="0"/>
-            <wp:docPr id="16" name="image20.png"/>
+            <wp:docPr id="32" name="image39.png"/>
             <a:graphic>
               <a:graphicData uri="http://schemas.openxmlformats.org/drawingml/2006/picture">
                 <pic:pic>
                   <pic:nvPicPr>
-                    <pic:cNvPr id="0" name="image20.png"/>
+                    <pic:cNvPr id="0" name="image39.png"/>
                     <pic:cNvPicPr preferRelativeResize="0"/>
                   </pic:nvPicPr>
                   <pic:blipFill>
@@ -5379,12 +5379,12 @@
           <wp:inline distB="114300" distT="114300" distL="114300" distR="114300">
             <wp:extent cx="6261555" cy="3200400"/>
             <wp:effectExtent b="0" l="0" r="0" t="0"/>
-            <wp:docPr id="7" name="image21.png"/>
+            <wp:docPr id="4" name="image14.png"/>
             <a:graphic>
               <a:graphicData uri="http://schemas.openxmlformats.org/drawingml/2006/picture">
                 <pic:pic>
                   <pic:nvPicPr>
-                    <pic:cNvPr id="0" name="image21.png"/>
+                    <pic:cNvPr id="0" name="image14.png"/>
                     <pic:cNvPicPr preferRelativeResize="0"/>
                   </pic:nvPicPr>
                   <pic:blipFill>
@@ -5520,12 +5520,12 @@
           <wp:inline distB="19050" distT="19050" distL="19050" distR="19050">
             <wp:extent cx="5760085" cy="662254"/>
             <wp:effectExtent b="0" l="0" r="0" t="0"/>
-            <wp:docPr id="11" name="image2.png"/>
+            <wp:docPr id="27" name="image17.png"/>
             <a:graphic>
               <a:graphicData uri="http://schemas.openxmlformats.org/drawingml/2006/picture">
                 <pic:pic>
                   <pic:nvPicPr>
-                    <pic:cNvPr id="0" name="image2.png"/>
+                    <pic:cNvPr id="0" name="image17.png"/>
                     <pic:cNvPicPr preferRelativeResize="0"/>
                   </pic:nvPicPr>
                   <pic:blipFill>
@@ -5622,12 +5622,12 @@
           <wp:inline distB="19050" distT="19050" distL="19050" distR="19050">
             <wp:extent cx="5760085" cy="647014"/>
             <wp:effectExtent b="0" l="0" r="0" t="0"/>
-            <wp:docPr id="21" name="image3.png"/>
+            <wp:docPr id="36" name="image20.png"/>
             <a:graphic>
               <a:graphicData uri="http://schemas.openxmlformats.org/drawingml/2006/picture">
                 <pic:pic>
                   <pic:nvPicPr>
-                    <pic:cNvPr id="0" name="image3.png"/>
+                    <pic:cNvPr id="0" name="image20.png"/>
                     <pic:cNvPicPr preferRelativeResize="0"/>
                   </pic:nvPicPr>
                   <pic:blipFill>
@@ -7039,12 +7039,12 @@
           <wp:inline distB="114300" distT="114300" distL="114300" distR="114300">
             <wp:extent cx="6261555" cy="3365500"/>
             <wp:effectExtent b="0" l="0" r="0" t="0"/>
-            <wp:docPr id="19" name="image9.png"/>
+            <wp:docPr id="34" name="image26.png"/>
             <a:graphic>
               <a:graphicData uri="http://schemas.openxmlformats.org/drawingml/2006/picture">
                 <pic:pic>
                   <pic:nvPicPr>
-                    <pic:cNvPr id="0" name="image9.png"/>
+                    <pic:cNvPr id="0" name="image26.png"/>
                     <pic:cNvPicPr preferRelativeResize="0"/>
                   </pic:nvPicPr>
                   <pic:blipFill>
@@ -7141,12 +7141,12 @@
           <wp:inline distB="19050" distT="19050" distL="19050" distR="19050">
             <wp:extent cx="141605" cy="141605"/>
             <wp:effectExtent b="0" l="0" r="0" t="0"/>
-            <wp:docPr id="18" name="image5.png"/>
+            <wp:docPr id="33" name="image23.png"/>
             <a:graphic>
               <a:graphicData uri="http://schemas.openxmlformats.org/drawingml/2006/picture">
                 <pic:pic>
                   <pic:nvPicPr>
-                    <pic:cNvPr id="0" name="image5.png"/>
+                    <pic:cNvPr id="0" name="image23.png"/>
                     <pic:cNvPicPr preferRelativeResize="0"/>
                   </pic:nvPicPr>
                   <pic:blipFill>
@@ -7617,12 +7617,12 @@
           <wp:inline distB="114300" distT="114300" distL="114300" distR="114300">
             <wp:extent cx="6261555" cy="4800600"/>
             <wp:effectExtent b="0" l="0" r="0" t="0"/>
-            <wp:docPr id="6" name="image15.png"/>
+            <wp:docPr id="3" name="image33.png"/>
             <a:graphic>
               <a:graphicData uri="http://schemas.openxmlformats.org/drawingml/2006/picture">
                 <pic:pic>
                   <pic:nvPicPr>
-                    <pic:cNvPr id="0" name="image15.png"/>
+                    <pic:cNvPr id="0" name="image33.png"/>
                     <pic:cNvPicPr preferRelativeResize="0"/>
                   </pic:nvPicPr>
                   <pic:blipFill>
@@ -7685,12 +7685,12 @@
           <wp:inline distB="114300" distT="114300" distL="114300" distR="114300">
             <wp:extent cx="6261555" cy="1828800"/>
             <wp:effectExtent b="0" l="0" r="0" t="0"/>
-            <wp:docPr id="39" name="image37.png"/>
+            <wp:docPr id="20" name="image7.png"/>
             <a:graphic>
               <a:graphicData uri="http://schemas.openxmlformats.org/drawingml/2006/picture">
                 <pic:pic>
                   <pic:nvPicPr>
-                    <pic:cNvPr id="0" name="image37.png"/>
+                    <pic:cNvPr id="0" name="image7.png"/>
                     <pic:cNvPicPr preferRelativeResize="0"/>
                   </pic:nvPicPr>
                   <pic:blipFill>
@@ -9519,12 +9519,12 @@
           <wp:inline distB="114300" distT="114300" distL="114300" distR="114300">
             <wp:extent cx="6172200" cy="2200275"/>
             <wp:effectExtent b="0" l="0" r="0" t="0"/>
-            <wp:docPr id="12" name="image8.png"/>
+            <wp:docPr id="28" name="image13.png"/>
             <a:graphic>
               <a:graphicData uri="http://schemas.openxmlformats.org/drawingml/2006/picture">
                 <pic:pic>
                   <pic:nvPicPr>
-                    <pic:cNvPr id="0" name="image8.png"/>
+                    <pic:cNvPr id="0" name="image13.png"/>
                     <pic:cNvPicPr preferRelativeResize="0"/>
                   </pic:nvPicPr>
                   <pic:blipFill>
@@ -9921,12 +9921,12 @@
           <wp:inline distB="114300" distT="114300" distL="114300" distR="114300">
             <wp:extent cx="6257925" cy="2171700"/>
             <wp:effectExtent b="0" l="0" r="0" t="0"/>
-            <wp:docPr id="15" name="image7.png"/>
+            <wp:docPr id="31" name="image31.png"/>
             <a:graphic>
               <a:graphicData uri="http://schemas.openxmlformats.org/drawingml/2006/picture">
                 <pic:pic>
                   <pic:nvPicPr>
-                    <pic:cNvPr id="0" name="image7.png"/>
+                    <pic:cNvPr id="0" name="image31.png"/>
                     <pic:cNvPicPr preferRelativeResize="0"/>
                   </pic:nvPicPr>
                   <pic:blipFill>
@@ -12001,12 +12001,12 @@
           <wp:inline distB="114300" distT="114300" distL="114300" distR="114300">
             <wp:extent cx="5553075" cy="1666875"/>
             <wp:effectExtent b="0" l="0" r="0" t="0"/>
-            <wp:docPr id="17" name="image11.png"/>
+            <wp:docPr id="8" name="image6.png"/>
             <a:graphic>
               <a:graphicData uri="http://schemas.openxmlformats.org/drawingml/2006/picture">
                 <pic:pic>
                   <pic:nvPicPr>
-                    <pic:cNvPr id="0" name="image11.png"/>
+                    <pic:cNvPr id="0" name="image6.png"/>
                     <pic:cNvPicPr preferRelativeResize="0"/>
                   </pic:nvPicPr>
                   <pic:blipFill>
@@ -12097,12 +12097,12 @@
           <wp:inline distB="114300" distT="114300" distL="114300" distR="114300">
             <wp:extent cx="5810250" cy="1609725"/>
             <wp:effectExtent b="0" l="0" r="0" t="0"/>
-            <wp:docPr id="29" name="image27.png"/>
+            <wp:docPr id="42" name="image37.png"/>
             <a:graphic>
               <a:graphicData uri="http://schemas.openxmlformats.org/drawingml/2006/picture">
                 <pic:pic>
                   <pic:nvPicPr>
-                    <pic:cNvPr id="0" name="image27.png"/>
+                    <pic:cNvPr id="0" name="image37.png"/>
                     <pic:cNvPicPr preferRelativeResize="0"/>
                   </pic:nvPicPr>
                   <pic:blipFill>
@@ -12193,12 +12193,12 @@
           <wp:inline distB="114300" distT="114300" distL="114300" distR="114300">
             <wp:extent cx="5581650" cy="1257300"/>
             <wp:effectExtent b="0" l="0" r="0" t="0"/>
-            <wp:docPr id="31" name="image31.png"/>
+            <wp:docPr id="45" name="image36.png"/>
             <a:graphic>
               <a:graphicData uri="http://schemas.openxmlformats.org/drawingml/2006/picture">
                 <pic:pic>
                   <pic:nvPicPr>
-                    <pic:cNvPr id="0" name="image31.png"/>
+                    <pic:cNvPr id="0" name="image36.png"/>
                     <pic:cNvPicPr preferRelativeResize="0"/>
                   </pic:nvPicPr>
                   <pic:blipFill>
@@ -12466,12 +12466,12 @@
           <wp:inline distB="114300" distT="114300" distL="114300" distR="114300">
             <wp:extent cx="5495925" cy="1638300"/>
             <wp:effectExtent b="0" l="0" r="0" t="0"/>
-            <wp:docPr id="13" name="image22.png"/>
+            <wp:docPr id="29" name="image19.png"/>
             <a:graphic>
               <a:graphicData uri="http://schemas.openxmlformats.org/drawingml/2006/picture">
                 <pic:pic>
                   <pic:nvPicPr>
-                    <pic:cNvPr id="0" name="image22.png"/>
+                    <pic:cNvPr id="0" name="image19.png"/>
                     <pic:cNvPicPr preferRelativeResize="0"/>
                   </pic:nvPicPr>
                   <pic:blipFill>
@@ -12899,12 +12899,12 @@
           <wp:inline distB="114300" distT="114300" distL="114300" distR="114300">
             <wp:extent cx="6067425" cy="4724400"/>
             <wp:effectExtent b="0" l="0" r="0" t="0"/>
-            <wp:docPr id="22" name="image24.png"/>
+            <wp:docPr id="37" name="image22.png"/>
             <a:graphic>
               <a:graphicData uri="http://schemas.openxmlformats.org/drawingml/2006/picture">
                 <pic:pic>
                   <pic:nvPicPr>
-                    <pic:cNvPr id="0" name="image24.png"/>
+                    <pic:cNvPr id="0" name="image22.png"/>
                     <pic:cNvPicPr preferRelativeResize="0"/>
                   </pic:nvPicPr>
                   <pic:blipFill>
@@ -15622,12 +15622,12 @@
           <wp:inline distB="114300" distT="114300" distL="114300" distR="114300">
             <wp:extent cx="6261555" cy="1905000"/>
             <wp:effectExtent b="0" l="0" r="0" t="0"/>
-            <wp:docPr id="25" name="image16.png"/>
+            <wp:docPr id="39" name="image5.png"/>
             <a:graphic>
               <a:graphicData uri="http://schemas.openxmlformats.org/drawingml/2006/picture">
                 <pic:pic>
                   <pic:nvPicPr>
-                    <pic:cNvPr id="0" name="image16.png"/>
+                    <pic:cNvPr id="0" name="image5.png"/>
                     <pic:cNvPicPr preferRelativeResize="0"/>
                   </pic:nvPicPr>
                   <pic:blipFill>
@@ -17143,12 +17143,12 @@
           <wp:inline distB="114300" distT="114300" distL="114300" distR="114300">
             <wp:extent cx="6261555" cy="3937000"/>
             <wp:effectExtent b="0" l="0" r="0" t="0"/>
-            <wp:docPr id="30" name="image28.png"/>
+            <wp:docPr id="43" name="image34.png"/>
             <a:graphic>
               <a:graphicData uri="http://schemas.openxmlformats.org/drawingml/2006/picture">
                 <pic:pic>
                   <pic:nvPicPr>
-                    <pic:cNvPr id="0" name="image28.png"/>
+                    <pic:cNvPr id="0" name="image34.png"/>
                     <pic:cNvPicPr preferRelativeResize="0"/>
                   </pic:nvPicPr>
                   <pic:blipFill>
@@ -17257,12 +17257,12 @@
           <wp:inline distB="114300" distT="114300" distL="114300" distR="114300">
             <wp:extent cx="6261555" cy="5435600"/>
             <wp:effectExtent b="0" l="0" r="0" t="0"/>
-            <wp:docPr id="32" name="image36.png"/>
+            <wp:docPr id="15" name="image32.png"/>
             <a:graphic>
               <a:graphicData uri="http://schemas.openxmlformats.org/drawingml/2006/picture">
                 <pic:pic>
                   <pic:nvPicPr>
-                    <pic:cNvPr id="0" name="image36.png"/>
+                    <pic:cNvPr id="0" name="image32.png"/>
                     <pic:cNvPicPr preferRelativeResize="0"/>
                   </pic:nvPicPr>
                   <pic:blipFill>
@@ -17746,12 +17746,12 @@
           <wp:inline distB="114300" distT="114300" distL="114300" distR="114300">
             <wp:extent cx="6261555" cy="1765300"/>
             <wp:effectExtent b="0" l="0" r="0" t="0"/>
-            <wp:docPr id="34" name="image34.png"/>
+            <wp:docPr id="46" name="image28.png"/>
             <a:graphic>
               <a:graphicData uri="http://schemas.openxmlformats.org/drawingml/2006/picture">
                 <pic:pic>
                   <pic:nvPicPr>
-                    <pic:cNvPr id="0" name="image34.png"/>
+                    <pic:cNvPr id="0" name="image28.png"/>
                     <pic:cNvPicPr preferRelativeResize="0"/>
                   </pic:nvPicPr>
                   <pic:blipFill>
@@ -18057,12 +18057,12 @@
           <wp:inline distB="114300" distT="114300" distL="114300" distR="114300">
             <wp:extent cx="6261555" cy="1574800"/>
             <wp:effectExtent b="0" l="0" r="0" t="0"/>
-            <wp:docPr id="38" name="image38.png"/>
+            <wp:docPr id="19" name="image3.png"/>
             <a:graphic>
               <a:graphicData uri="http://schemas.openxmlformats.org/drawingml/2006/picture">
                 <pic:pic>
                   <pic:nvPicPr>
-                    <pic:cNvPr id="0" name="image38.png"/>
+                    <pic:cNvPr id="0" name="image3.png"/>
                     <pic:cNvPicPr preferRelativeResize="0"/>
                   </pic:nvPicPr>
                   <pic:blipFill>
@@ -19188,12 +19188,12 @@
           <wp:inline distB="114300" distT="114300" distL="114300" distR="114300">
             <wp:extent cx="6261555" cy="4851400"/>
             <wp:effectExtent b="0" l="0" r="0" t="0"/>
-            <wp:docPr id="36" name="image30.png"/>
+            <wp:docPr id="17" name="image15.png"/>
             <a:graphic>
               <a:graphicData uri="http://schemas.openxmlformats.org/drawingml/2006/picture">
                 <pic:pic>
                   <pic:nvPicPr>
-                    <pic:cNvPr id="0" name="image30.png"/>
+                    <pic:cNvPr id="0" name="image15.png"/>
                     <pic:cNvPicPr preferRelativeResize="0"/>
                   </pic:nvPicPr>
                   <pic:blipFill>
@@ -19329,12 +19329,12 @@
           <wp:inline distB="114300" distT="114300" distL="114300" distR="114300">
             <wp:extent cx="6076950" cy="581025"/>
             <wp:effectExtent b="0" l="0" r="0" t="0"/>
-            <wp:docPr id="24" name="image19.png"/>
+            <wp:docPr id="9" name="image2.png"/>
             <a:graphic>
               <a:graphicData uri="http://schemas.openxmlformats.org/drawingml/2006/picture">
                 <pic:pic>
                   <pic:nvPicPr>
-                    <pic:cNvPr id="0" name="image19.png"/>
+                    <pic:cNvPr id="0" name="image2.png"/>
                     <pic:cNvPicPr preferRelativeResize="0"/>
                   </pic:nvPicPr>
                   <pic:blipFill>
@@ -19403,12 +19403,12 @@
           <wp:inline distB="114300" distT="114300" distL="114300" distR="114300">
             <wp:extent cx="6261555" cy="5473700"/>
             <wp:effectExtent b="0" l="0" r="0" t="0"/>
-            <wp:docPr id="5" name="image10.png"/>
+            <wp:docPr id="23" name="image4.png"/>
             <a:graphic>
               <a:graphicData uri="http://schemas.openxmlformats.org/drawingml/2006/picture">
                 <pic:pic>
                   <pic:nvPicPr>
-                    <pic:cNvPr id="0" name="image10.png"/>
+                    <pic:cNvPr id="0" name="image4.png"/>
                     <pic:cNvPicPr preferRelativeResize="0"/>
                   </pic:nvPicPr>
                   <pic:blipFill>
@@ -19590,12 +19590,12 @@
           <wp:inline distB="114300" distT="114300" distL="114300" distR="114300">
             <wp:extent cx="6261555" cy="5765800"/>
             <wp:effectExtent b="0" l="0" r="0" t="0"/>
-            <wp:docPr id="23" name="image23.png"/>
+            <wp:docPr id="38" name="image24.png"/>
             <a:graphic>
               <a:graphicData uri="http://schemas.openxmlformats.org/drawingml/2006/picture">
                 <pic:pic>
                   <pic:nvPicPr>
-                    <pic:cNvPr id="0" name="image23.png"/>
+                    <pic:cNvPr id="0" name="image24.png"/>
                     <pic:cNvPicPr preferRelativeResize="0"/>
                   </pic:nvPicPr>
                   <pic:blipFill>
@@ -19632,12 +19632,12 @@
           <wp:inline distB="114300" distT="114300" distL="114300" distR="114300">
             <wp:extent cx="5619750" cy="704850"/>
             <wp:effectExtent b="0" l="0" r="0" t="0"/>
-            <wp:docPr id="20" name="image17.png"/>
+            <wp:docPr id="35" name="image25.png"/>
             <a:graphic>
               <a:graphicData uri="http://schemas.openxmlformats.org/drawingml/2006/picture">
                 <pic:pic>
                   <pic:nvPicPr>
-                    <pic:cNvPr id="0" name="image17.png"/>
+                    <pic:cNvPr id="0" name="image25.png"/>
                     <pic:cNvPicPr preferRelativeResize="0"/>
                   </pic:nvPicPr>
                   <pic:blipFill>
@@ -19833,12 +19833,12 @@
           <wp:inline distB="114300" distT="114300" distL="114300" distR="114300">
             <wp:extent cx="4772025" cy="266700"/>
             <wp:effectExtent b="0" l="0" r="0" t="0"/>
-            <wp:docPr id="4" name="image14.png"/>
+            <wp:docPr id="22" name="image21.png"/>
             <a:graphic>
               <a:graphicData uri="http://schemas.openxmlformats.org/drawingml/2006/picture">
                 <pic:pic>
                   <pic:nvPicPr>
-                    <pic:cNvPr id="0" name="image14.png"/>
+                    <pic:cNvPr id="0" name="image21.png"/>
                     <pic:cNvPicPr preferRelativeResize="0"/>
                   </pic:nvPicPr>
                   <pic:blipFill>
@@ -21916,6 +21916,132 @@
     </w:p>
     <w:p>
       <w:pPr>
+        <w:widowControl w:val="0"/>
+        <w:spacing w:before="31.329345703125" w:line="345.2317142486572" w:lineRule="auto"/>
+        <w:rPr>
+          <w:rFonts w:ascii="Times New Roman" w:cs="Times New Roman" w:eastAsia="Times New Roman" w:hAnsi="Times New Roman"/>
+          <w:sz w:val="25.920000076293945"/>
+          <w:szCs w:val="25.920000076293945"/>
+        </w:rPr>
+      </w:pPr>
+      <w:r>
+        <w:rPr>
+          <w:rFonts w:ascii="Times New Roman" w:cs="Times New Roman" w:eastAsia="Times New Roman" w:hAnsi="Times New Roman"/>
+          <w:sz w:val="25.920000076293945"/>
+          <w:szCs w:val="25.920000076293945"/>
+        </w:rPr>
+        <w:drawing>
+          <wp:inline distB="114300" distT="114300" distL="114300" distR="114300">
+            <wp:extent cx="6261555" cy="3441700"/>
+            <wp:effectExtent b="0" l="0" r="0" t="0"/>
+            <wp:docPr id="5" name="image10.png"/>
+            <a:graphic>
+              <a:graphicData uri="http://schemas.openxmlformats.org/drawingml/2006/picture">
+                <pic:pic>
+                  <pic:nvPicPr>
+                    <pic:cNvPr id="0" name="image10.png"/>
+                    <pic:cNvPicPr preferRelativeResize="0"/>
+                  </pic:nvPicPr>
+                  <pic:blipFill>
+                    <a:blip r:embed="rId9"/>
+                    <a:srcRect b="0" l="0" r="0" t="0"/>
+                    <a:stretch>
+                      <a:fillRect/>
+                    </a:stretch>
+                  </pic:blipFill>
+                  <pic:spPr>
+                    <a:xfrm>
+                      <a:off x="0" y="0"/>
+                      <a:ext cx="6261555" cy="3441700"/>
+                    </a:xfrm>
+                    <a:prstGeom prst="rect"/>
+                    <a:ln/>
+                  </pic:spPr>
+                </pic:pic>
+              </a:graphicData>
+            </a:graphic>
+          </wp:inline>
+        </w:drawing>
+      </w:r>
+      <w:r>
+        <w:rPr>
+          <w:rtl w:val="0"/>
+        </w:rPr>
+      </w:r>
+    </w:p>
+    <w:p>
+      <w:pPr>
+        <w:widowControl w:val="0"/>
+        <w:spacing w:before="122.313232421875" w:line="345.23194313049316" w:lineRule="auto"/>
+        <w:rPr>
+          <w:rFonts w:ascii="Times New Roman" w:cs="Times New Roman" w:eastAsia="Times New Roman" w:hAnsi="Times New Roman"/>
+          <w:sz w:val="25.920000076293945"/>
+          <w:szCs w:val="25.920000076293945"/>
+        </w:rPr>
+      </w:pPr>
+      <w:r>
+        <w:rPr>
+          <w:rtl w:val="0"/>
+        </w:rPr>
+      </w:r>
+    </w:p>
+    <w:p>
+      <w:pPr>
+        <w:widowControl w:val="0"/>
+        <w:spacing w:before="248.062744140625" w:line="361.8006706237793" w:lineRule="auto"/>
+        <w:rPr>
+          <w:rFonts w:ascii="Times New Roman" w:cs="Times New Roman" w:eastAsia="Times New Roman" w:hAnsi="Times New Roman"/>
+          <w:sz w:val="25.920000076293945"/>
+          <w:szCs w:val="25.920000076293945"/>
+        </w:rPr>
+      </w:pPr>
+      <w:r>
+        <w:rPr>
+          <w:rFonts w:ascii="Times New Roman" w:cs="Times New Roman" w:eastAsia="Times New Roman" w:hAnsi="Times New Roman"/>
+          <w:sz w:val="25.920000076293945"/>
+          <w:szCs w:val="25.920000076293945"/>
+        </w:rPr>
+        <w:drawing>
+          <wp:inline distB="114300" distT="114300" distL="114300" distR="114300">
+            <wp:extent cx="6261555" cy="3492500"/>
+            <wp:effectExtent b="0" l="0" r="0" t="0"/>
+            <wp:docPr id="10" name="image27.png"/>
+            <a:graphic>
+              <a:graphicData uri="http://schemas.openxmlformats.org/drawingml/2006/picture">
+                <pic:pic>
+                  <pic:nvPicPr>
+                    <pic:cNvPr id="0" name="image27.png"/>
+                    <pic:cNvPicPr preferRelativeResize="0"/>
+                  </pic:nvPicPr>
+                  <pic:blipFill>
+                    <a:blip r:embed="rId10"/>
+                    <a:srcRect b="0" l="0" r="0" t="0"/>
+                    <a:stretch>
+                      <a:fillRect/>
+                    </a:stretch>
+                  </pic:blipFill>
+                  <pic:spPr>
+                    <a:xfrm>
+                      <a:off x="0" y="0"/>
+                      <a:ext cx="6261555" cy="3492500"/>
+                    </a:xfrm>
+                    <a:prstGeom prst="rect"/>
+                    <a:ln/>
+                  </pic:spPr>
+                </pic:pic>
+              </a:graphicData>
+            </a:graphic>
+          </wp:inline>
+        </w:drawing>
+      </w:r>
+      <w:r>
+        <w:rPr>
+          <w:rtl w:val="0"/>
+        </w:rPr>
+      </w:r>
+    </w:p>
+    <w:p>
+      <w:pPr>
         <w:keepNext w:val="0"/>
         <w:keepLines w:val="0"/>
         <w:pageBreakBefore w:val="0"/>
@@ -21984,6 +22110,62 @@
           <w:rtl w:val="0"/>
         </w:rPr>
         <w:t xml:space="preserve">Ảnh 2: ifconfig/ip trên Metasploitable 2, thấy IP thật của máy đích. </w:t>
+      </w:r>
+    </w:p>
+    <w:p>
+      <w:pPr>
+        <w:widowControl w:val="0"/>
+        <w:spacing w:before="146.3134765625" w:line="346.3116645812988" w:lineRule="auto"/>
+        <w:ind w:left="325.123291015625" w:right="-8.800048828125" w:firstLine="0"/>
+        <w:rPr>
+          <w:rFonts w:ascii="Times New Roman" w:cs="Times New Roman" w:eastAsia="Times New Roman" w:hAnsi="Times New Roman"/>
+          <w:sz w:val="25.920000076293945"/>
+          <w:szCs w:val="25.920000076293945"/>
+        </w:rPr>
+      </w:pPr>
+      <w:r>
+        <w:rPr>
+          <w:rFonts w:ascii="Times New Roman" w:cs="Times New Roman" w:eastAsia="Times New Roman" w:hAnsi="Times New Roman"/>
+          <w:sz w:val="25.920000076293945"/>
+          <w:szCs w:val="25.920000076293945"/>
+        </w:rPr>
+        <w:drawing>
+          <wp:inline distB="114300" distT="114300" distL="114300" distR="114300">
+            <wp:extent cx="6261555" cy="1828800"/>
+            <wp:effectExtent b="0" l="0" r="0" t="0"/>
+            <wp:docPr id="40" name="image7.png"/>
+            <a:graphic>
+              <a:graphicData uri="http://schemas.openxmlformats.org/drawingml/2006/picture">
+                <pic:pic>
+                  <pic:nvPicPr>
+                    <pic:cNvPr id="0" name="image7.png"/>
+                    <pic:cNvPicPr preferRelativeResize="0"/>
+                  </pic:nvPicPr>
+                  <pic:blipFill>
+                    <a:blip r:embed="rId23"/>
+                    <a:srcRect b="0" l="0" r="0" t="0"/>
+                    <a:stretch>
+                      <a:fillRect/>
+                    </a:stretch>
+                  </pic:blipFill>
+                  <pic:spPr>
+                    <a:xfrm>
+                      <a:off x="0" y="0"/>
+                      <a:ext cx="6261555" cy="1828800"/>
+                    </a:xfrm>
+                    <a:prstGeom prst="rect"/>
+                    <a:ln/>
+                  </pic:spPr>
+                </pic:pic>
+              </a:graphicData>
+            </a:graphic>
+          </wp:inline>
+        </w:drawing>
+      </w:r>
+      <w:r>
+        <w:rPr>
+          <w:rtl w:val="0"/>
+        </w:rPr>
       </w:r>
     </w:p>
     <w:p>
@@ -22060,6 +22242,62 @@
     </w:p>
     <w:p>
       <w:pPr>
+        <w:widowControl w:val="0"/>
+        <w:spacing w:before="146.3134765625" w:line="346.3116645812988" w:lineRule="auto"/>
+        <w:ind w:left="325.123291015625" w:right="-8.800048828125" w:firstLine="0"/>
+        <w:rPr>
+          <w:rFonts w:ascii="Times New Roman" w:cs="Times New Roman" w:eastAsia="Times New Roman" w:hAnsi="Times New Roman"/>
+          <w:sz w:val="25.920000076293945"/>
+          <w:szCs w:val="25.920000076293945"/>
+        </w:rPr>
+      </w:pPr>
+      <w:r>
+        <w:rPr>
+          <w:rFonts w:ascii="Times New Roman" w:cs="Times New Roman" w:eastAsia="Times New Roman" w:hAnsi="Times New Roman"/>
+          <w:sz w:val="25.920000076293945"/>
+          <w:szCs w:val="25.920000076293945"/>
+        </w:rPr>
+        <w:drawing>
+          <wp:inline distB="114300" distT="114300" distL="114300" distR="114300">
+            <wp:extent cx="6261555" cy="4800600"/>
+            <wp:effectExtent b="0" l="0" r="0" t="0"/>
+            <wp:docPr id="50" name="image33.png"/>
+            <a:graphic>
+              <a:graphicData uri="http://schemas.openxmlformats.org/drawingml/2006/picture">
+                <pic:pic>
+                  <pic:nvPicPr>
+                    <pic:cNvPr id="0" name="image33.png"/>
+                    <pic:cNvPicPr preferRelativeResize="0"/>
+                  </pic:nvPicPr>
+                  <pic:blipFill>
+                    <a:blip r:embed="rId22"/>
+                    <a:srcRect b="0" l="0" r="0" t="0"/>
+                    <a:stretch>
+                      <a:fillRect/>
+                    </a:stretch>
+                  </pic:blipFill>
+                  <pic:spPr>
+                    <a:xfrm>
+                      <a:off x="0" y="0"/>
+                      <a:ext cx="6261555" cy="4800600"/>
+                    </a:xfrm>
+                    <a:prstGeom prst="rect"/>
+                    <a:ln/>
+                  </pic:spPr>
+                </pic:pic>
+              </a:graphicData>
+            </a:graphic>
+          </wp:inline>
+        </w:drawing>
+      </w:r>
+      <w:r>
+        <w:rPr>
+          <w:rtl w:val="0"/>
+        </w:rPr>
+      </w:r>
+    </w:p>
+    <w:p>
+      <w:pPr>
         <w:keepNext w:val="0"/>
         <w:keepLines w:val="0"/>
         <w:pageBreakBefore w:val="0"/>
@@ -22128,6 +22366,132 @@
           <w:rtl w:val="0"/>
         </w:rPr>
         <w:t xml:space="preserve">Ảnh 4: kết quả -sS hoặc -sT. </w:t>
+      </w:r>
+    </w:p>
+    <w:p>
+      <w:pPr>
+        <w:widowControl w:val="0"/>
+        <w:spacing w:before="151.19384765625" w:line="240.67666053771973" w:lineRule="auto"/>
+        <w:ind w:left="386.9999694824219" w:right="397.20458984375" w:firstLine="0"/>
+        <w:jc w:val="center"/>
+        <w:rPr>
+          <w:rFonts w:ascii="Calibri" w:cs="Calibri" w:eastAsia="Calibri" w:hAnsi="Calibri"/>
+          <w:b w:val="1"/>
+          <w:bCs w:val="1"/>
+          <w:color w:val="2f75b5"/>
+          <w:sz w:val="25.920000076293945"/>
+          <w:szCs w:val="25.920000076293945"/>
+        </w:rPr>
+      </w:pPr>
+      <w:r>
+        <w:rPr>
+          <w:rFonts w:ascii="Calibri" w:cs="Calibri" w:eastAsia="Calibri" w:hAnsi="Calibri"/>
+          <w:b w:val="1"/>
+          <w:bCs w:val="1"/>
+          <w:color w:val="2f75b5"/>
+          <w:sz w:val="25.920000076293945"/>
+          <w:szCs w:val="25.920000076293945"/>
+        </w:rPr>
+        <w:drawing>
+          <wp:inline distB="114300" distT="114300" distL="114300" distR="114300">
+            <wp:extent cx="6257925" cy="2171700"/>
+            <wp:effectExtent b="0" l="0" r="0" t="0"/>
+            <wp:docPr id="18" name="image31.png"/>
+            <a:graphic>
+              <a:graphicData uri="http://schemas.openxmlformats.org/drawingml/2006/picture">
+                <pic:pic>
+                  <pic:nvPicPr>
+                    <pic:cNvPr id="0" name="image31.png"/>
+                    <pic:cNvPicPr preferRelativeResize="0"/>
+                  </pic:nvPicPr>
+                  <pic:blipFill>
+                    <a:blip r:embed="rId25"/>
+                    <a:srcRect b="0" l="0" r="0" t="0"/>
+                    <a:stretch>
+                      <a:fillRect/>
+                    </a:stretch>
+                  </pic:blipFill>
+                  <pic:spPr>
+                    <a:xfrm>
+                      <a:off x="0" y="0"/>
+                      <a:ext cx="6257925" cy="2171700"/>
+                    </a:xfrm>
+                    <a:prstGeom prst="rect"/>
+                    <a:ln/>
+                  </pic:spPr>
+                </pic:pic>
+              </a:graphicData>
+            </a:graphic>
+          </wp:inline>
+        </w:drawing>
+      </w:r>
+      <w:r>
+        <w:rPr>
+          <w:rtl w:val="0"/>
+        </w:rPr>
+      </w:r>
+    </w:p>
+    <w:p>
+      <w:pPr>
+        <w:widowControl w:val="0"/>
+        <w:spacing w:before="136.19384765625" w:line="241.20397567749023" w:lineRule="auto"/>
+        <w:ind w:left="386.9999694824219" w:right="397.20458984375" w:firstLine="0"/>
+        <w:jc w:val="center"/>
+        <w:rPr>
+          <w:rFonts w:ascii="Calibri" w:cs="Calibri" w:eastAsia="Calibri" w:hAnsi="Calibri"/>
+          <w:b w:val="1"/>
+          <w:bCs w:val="1"/>
+          <w:color w:val="2f75b5"/>
+          <w:sz w:val="25.920000076293945"/>
+          <w:szCs w:val="25.920000076293945"/>
+        </w:rPr>
+      </w:pPr>
+      <w:r>
+        <w:rPr>
+          <w:rFonts w:ascii="Times New Roman" w:cs="Times New Roman" w:eastAsia="Times New Roman" w:hAnsi="Times New Roman"/>
+          <w:b w:val="1"/>
+          <w:bCs w:val="1"/>
+          <w:color w:val="2f75b5"/>
+          <w:sz w:val="25.920000076293945"/>
+          <w:szCs w:val="25.920000076293945"/>
+        </w:rPr>
+        <w:drawing>
+          <wp:inline distB="114300" distT="114300" distL="114300" distR="114300">
+            <wp:extent cx="6172200" cy="2200275"/>
+            <wp:effectExtent b="0" l="0" r="0" t="0"/>
+            <wp:docPr id="6" name="image13.png"/>
+            <a:graphic>
+              <a:graphicData uri="http://schemas.openxmlformats.org/drawingml/2006/picture">
+                <pic:pic>
+                  <pic:nvPicPr>
+                    <pic:cNvPr id="0" name="image13.png"/>
+                    <pic:cNvPicPr preferRelativeResize="0"/>
+                  </pic:nvPicPr>
+                  <pic:blipFill>
+                    <a:blip r:embed="rId24"/>
+                    <a:srcRect b="0" l="0" r="0" t="0"/>
+                    <a:stretch>
+                      <a:fillRect/>
+                    </a:stretch>
+                  </pic:blipFill>
+                  <pic:spPr>
+                    <a:xfrm>
+                      <a:off x="0" y="0"/>
+                      <a:ext cx="6172200" cy="2200275"/>
+                    </a:xfrm>
+                    <a:prstGeom prst="rect"/>
+                    <a:ln/>
+                  </pic:spPr>
+                </pic:pic>
+              </a:graphicData>
+            </a:graphic>
+          </wp:inline>
+        </w:drawing>
+      </w:r>
+      <w:r>
+        <w:rPr>
+          <w:rtl w:val="0"/>
+        </w:rPr>
       </w:r>
     </w:p>
     <w:p>
@@ -22204,6 +22568,66 @@
     </w:p>
     <w:p>
       <w:pPr>
+        <w:widowControl w:val="0"/>
+        <w:spacing w:before="160.194091796875" w:line="242.97706604003906" w:lineRule="auto"/>
+        <w:ind w:left="386.9999694824219" w:right="397.20458984375" w:firstLine="0"/>
+        <w:jc w:val="center"/>
+        <w:rPr>
+          <w:rFonts w:ascii="Times New Roman" w:cs="Times New Roman" w:eastAsia="Times New Roman" w:hAnsi="Times New Roman"/>
+          <w:sz w:val="25.920000076293945"/>
+          <w:szCs w:val="25.920000076293945"/>
+        </w:rPr>
+      </w:pPr>
+      <w:r>
+        <w:rPr>
+          <w:rFonts w:ascii="Times New Roman" w:cs="Times New Roman" w:eastAsia="Times New Roman" w:hAnsi="Times New Roman"/>
+          <w:b w:val="1"/>
+          <w:bCs w:val="1"/>
+          <w:color w:val="2f75b5"/>
+          <w:sz w:val="25.920000076293945"/>
+          <w:szCs w:val="25.920000076293945"/>
+        </w:rPr>
+        <w:drawing>
+          <wp:inline distB="114300" distT="114300" distL="114300" distR="114300">
+            <wp:extent cx="6261555" cy="1905000"/>
+            <wp:effectExtent b="0" l="0" r="0" t="0"/>
+            <wp:docPr id="14" name="image5.png"/>
+            <a:graphic>
+              <a:graphicData uri="http://schemas.openxmlformats.org/drawingml/2006/picture">
+                <pic:pic>
+                  <pic:nvPicPr>
+                    <pic:cNvPr id="0" name="image5.png"/>
+                    <pic:cNvPicPr preferRelativeResize="0"/>
+                  </pic:nvPicPr>
+                  <pic:blipFill>
+                    <a:blip r:embed="rId31"/>
+                    <a:srcRect b="0" l="0" r="0" t="0"/>
+                    <a:stretch>
+                      <a:fillRect/>
+                    </a:stretch>
+                  </pic:blipFill>
+                  <pic:spPr>
+                    <a:xfrm>
+                      <a:off x="0" y="0"/>
+                      <a:ext cx="6261555" cy="1905000"/>
+                    </a:xfrm>
+                    <a:prstGeom prst="rect"/>
+                    <a:ln/>
+                  </pic:spPr>
+                </pic:pic>
+              </a:graphicData>
+            </a:graphic>
+          </wp:inline>
+        </w:drawing>
+      </w:r>
+      <w:r>
+        <w:rPr>
+          <w:rtl w:val="0"/>
+        </w:rPr>
+      </w:r>
+    </w:p>
+    <w:p>
+      <w:pPr>
         <w:keepNext w:val="0"/>
         <w:keepLines w:val="0"/>
         <w:pageBreakBefore w:val="0"/>
@@ -22272,6 +22696,132 @@
           <w:rtl w:val="0"/>
         </w:rPr>
         <w:t xml:space="preserve">Ảnh 6: kết quả -O hoặc -A. </w:t>
+      </w:r>
+    </w:p>
+    <w:p>
+      <w:pPr>
+        <w:widowControl w:val="0"/>
+        <w:spacing w:before="133.99383544921875" w:line="247.96817779541016" w:lineRule="auto"/>
+        <w:ind w:left="386.9999694824219" w:right="397.20458984375" w:firstLine="0"/>
+        <w:jc w:val="center"/>
+        <w:rPr>
+          <w:rFonts w:ascii="Times New Roman" w:cs="Times New Roman" w:eastAsia="Times New Roman" w:hAnsi="Times New Roman"/>
+          <w:b w:val="1"/>
+          <w:bCs w:val="1"/>
+          <w:color w:val="2f75b5"/>
+          <w:sz w:val="25.920000076293945"/>
+          <w:szCs w:val="25.920000076293945"/>
+        </w:rPr>
+      </w:pPr>
+      <w:r>
+        <w:rPr>
+          <w:rFonts w:ascii="Times New Roman" w:cs="Times New Roman" w:eastAsia="Times New Roman" w:hAnsi="Times New Roman"/>
+          <w:b w:val="1"/>
+          <w:bCs w:val="1"/>
+          <w:color w:val="2f75b5"/>
+          <w:sz w:val="25.920000076293945"/>
+          <w:szCs w:val="25.920000076293945"/>
+        </w:rPr>
+        <w:drawing>
+          <wp:inline distB="114300" distT="114300" distL="114300" distR="114300">
+            <wp:extent cx="6261555" cy="3937000"/>
+            <wp:effectExtent b="0" l="0" r="0" t="0"/>
+            <wp:docPr id="48" name="image34.png"/>
+            <a:graphic>
+              <a:graphicData uri="http://schemas.openxmlformats.org/drawingml/2006/picture">
+                <pic:pic>
+                  <pic:nvPicPr>
+                    <pic:cNvPr id="0" name="image34.png"/>
+                    <pic:cNvPicPr preferRelativeResize="0"/>
+                  </pic:nvPicPr>
+                  <pic:blipFill>
+                    <a:blip r:embed="rId32"/>
+                    <a:srcRect b="0" l="0" r="0" t="0"/>
+                    <a:stretch>
+                      <a:fillRect/>
+                    </a:stretch>
+                  </pic:blipFill>
+                  <pic:spPr>
+                    <a:xfrm>
+                      <a:off x="0" y="0"/>
+                      <a:ext cx="6261555" cy="3937000"/>
+                    </a:xfrm>
+                    <a:prstGeom prst="rect"/>
+                    <a:ln/>
+                  </pic:spPr>
+                </pic:pic>
+              </a:graphicData>
+            </a:graphic>
+          </wp:inline>
+        </w:drawing>
+      </w:r>
+      <w:r>
+        <w:rPr>
+          <w:rtl w:val="0"/>
+        </w:rPr>
+      </w:r>
+    </w:p>
+    <w:p>
+      <w:pPr>
+        <w:widowControl w:val="0"/>
+        <w:spacing w:before="13.1396484375" w:line="264.43053245544434" w:lineRule="auto"/>
+        <w:ind w:left="57.07206726074219" w:right="397.20458984375" w:firstLine="0"/>
+        <w:jc w:val="center"/>
+        <w:rPr>
+          <w:rFonts w:ascii="Times New Roman" w:cs="Times New Roman" w:eastAsia="Times New Roman" w:hAnsi="Times New Roman"/>
+          <w:b w:val="1"/>
+          <w:bCs w:val="1"/>
+          <w:color w:val="2f75b5"/>
+          <w:sz w:val="25.920000076293945"/>
+          <w:szCs w:val="25.920000076293945"/>
+        </w:rPr>
+      </w:pPr>
+      <w:r>
+        <w:rPr>
+          <w:rFonts w:ascii="Times New Roman" w:cs="Times New Roman" w:eastAsia="Times New Roman" w:hAnsi="Times New Roman"/>
+          <w:b w:val="1"/>
+          <w:bCs w:val="1"/>
+          <w:color w:val="2f75b5"/>
+          <w:sz w:val="25.920000076293945"/>
+          <w:szCs w:val="25.920000076293945"/>
+        </w:rPr>
+        <w:drawing>
+          <wp:inline distB="114300" distT="114300" distL="114300" distR="114300">
+            <wp:extent cx="6261555" cy="5435600"/>
+            <wp:effectExtent b="0" l="0" r="0" t="0"/>
+            <wp:docPr id="44" name="image32.png"/>
+            <a:graphic>
+              <a:graphicData uri="http://schemas.openxmlformats.org/drawingml/2006/picture">
+                <pic:pic>
+                  <pic:nvPicPr>
+                    <pic:cNvPr id="0" name="image32.png"/>
+                    <pic:cNvPicPr preferRelativeResize="0"/>
+                  </pic:nvPicPr>
+                  <pic:blipFill>
+                    <a:blip r:embed="rId33"/>
+                    <a:srcRect b="0" l="0" r="0" t="0"/>
+                    <a:stretch>
+                      <a:fillRect/>
+                    </a:stretch>
+                  </pic:blipFill>
+                  <pic:spPr>
+                    <a:xfrm>
+                      <a:off x="0" y="0"/>
+                      <a:ext cx="6261555" cy="5435600"/>
+                    </a:xfrm>
+                    <a:prstGeom prst="rect"/>
+                    <a:ln/>
+                  </pic:spPr>
+                </pic:pic>
+              </a:graphicData>
+            </a:graphic>
+          </wp:inline>
+        </w:drawing>
+      </w:r>
+      <w:r>
+        <w:rPr>
+          <w:rtl w:val="0"/>
+        </w:rPr>
       </w:r>
     </w:p>
     <w:p>
@@ -22345,6 +22895,53 @@
         </w:rPr>
         <w:t xml:space="preserve">Ảnh 7: một NSE script và kết luận dựa trên chính output. </w:t>
       </w:r>
+      <w:r>
+        <w:rPr>
+          <w:rFonts w:ascii="Times New Roman" w:cs="Times New Roman" w:eastAsia="Times New Roman" w:hAnsi="Times New Roman"/>
+          <w:b w:val="1"/>
+          <w:bCs w:val="1"/>
+          <w:color w:val="2f75b5"/>
+          <w:sz w:val="25.920000076293945"/>
+          <w:szCs w:val="25.920000076293945"/>
+        </w:rPr>
+        <w:drawing>
+          <wp:inline distB="114300" distT="114300" distL="114300" distR="114300">
+            <wp:extent cx="6261555" cy="4851400"/>
+            <wp:effectExtent b="0" l="0" r="0" t="0"/>
+            <wp:docPr id="30" name="image15.png"/>
+            <a:graphic>
+              <a:graphicData uri="http://schemas.openxmlformats.org/drawingml/2006/picture">
+                <pic:pic>
+                  <pic:nvPicPr>
+                    <pic:cNvPr id="0" name="image15.png"/>
+                    <pic:cNvPicPr preferRelativeResize="0"/>
+                  </pic:nvPicPr>
+                  <pic:blipFill>
+                    <a:blip r:embed="rId37"/>
+                    <a:srcRect b="0" l="0" r="0" t="0"/>
+                    <a:stretch>
+                      <a:fillRect/>
+                    </a:stretch>
+                  </pic:blipFill>
+                  <pic:spPr>
+                    <a:xfrm>
+                      <a:off x="0" y="0"/>
+                      <a:ext cx="6261555" cy="4851400"/>
+                    </a:xfrm>
+                    <a:prstGeom prst="rect"/>
+                    <a:ln/>
+                  </pic:spPr>
+                </pic:pic>
+              </a:graphicData>
+            </a:graphic>
+          </wp:inline>
+        </w:drawing>
+      </w:r>
+      <w:r>
+        <w:rPr>
+          <w:rtl w:val="0"/>
+        </w:rPr>
+      </w:r>
     </w:p>
     <w:p>
       <w:pPr>
@@ -22416,6 +23013,48 @@
           <w:rtl w:val="0"/>
         </w:rPr>
         <w:t xml:space="preserve">Ảnh 8: tệp kết quả được lưu (.txt hoặc .xml) và/hoặc HTML nếu có. </w:t>
+      </w:r>
+      <w:r>
+        <w:rPr>
+          <w:rFonts w:ascii="Times New Roman" w:cs="Times New Roman" w:eastAsia="Times New Roman" w:hAnsi="Times New Roman"/>
+          <w:b w:val="1"/>
+          <w:bCs w:val="1"/>
+          <w:color w:val="2f75b5"/>
+          <w:sz w:val="25.920000076293945"/>
+          <w:szCs w:val="25.920000076293945"/>
+        </w:rPr>
+        <w:drawing>
+          <wp:inline distB="114300" distT="114300" distL="114300" distR="114300">
+            <wp:extent cx="6261555" cy="5473700"/>
+            <wp:effectExtent b="0" l="0" r="0" t="0"/>
+            <wp:docPr id="13" name="image4.png"/>
+            <a:graphic>
+              <a:graphicData uri="http://schemas.openxmlformats.org/drawingml/2006/picture">
+                <pic:pic>
+                  <pic:nvPicPr>
+                    <pic:cNvPr id="0" name="image4.png"/>
+                    <pic:cNvPicPr preferRelativeResize="0"/>
+                  </pic:nvPicPr>
+                  <pic:blipFill>
+                    <a:blip r:embed="rId39"/>
+                    <a:srcRect b="0" l="0" r="0" t="0"/>
+                    <a:stretch>
+                      <a:fillRect/>
+                    </a:stretch>
+                  </pic:blipFill>
+                  <pic:spPr>
+                    <a:xfrm>
+                      <a:off x="0" y="0"/>
+                      <a:ext cx="6261555" cy="5473700"/>
+                    </a:xfrm>
+                    <a:prstGeom prst="rect"/>
+                    <a:ln/>
+                  </pic:spPr>
+                </pic:pic>
+              </a:graphicData>
+            </a:graphic>
+          </wp:inline>
+        </w:drawing>
       </w:r>
       <w:r>
         <w:rPr>

</xml_diff>